<commit_message>
docs/comments: platform-neutral wording; drop machine-specific references
Same audit as fungiforge: "Mac dev", "Mac/offline CI", "authored on Apple Silicon",
"Completes on a Mac", "this machine" reworded neutrally; Apple Silicon guidance kept.
Manual DOCX/PDF regenerated. No functional change.
</commit_message>
<xml_diff>
--- a/docs/manual/callforge_manual.docx
+++ b/docs/manual/callforge_manual.docx
@@ -82,7 +82,7 @@
         <w:p>
           <w:r>
             <w:fldChar w:fldCharType="begin" w:dirty="true"/>
-            <w:instrText xml:space="preserve">TOC \o "1-3" \h \z \u</w:instrText>
+            <w:instrText xml:space="preserve">TOC \o "1-2" \h \z \u</w:instrText>
             <w:fldChar w:fldCharType="separate"/>
             <w:fldChar w:fldCharType="end"/>
           </w:r>
@@ -100,6 +100,15 @@
         <w:pStyle w:val="Heading1"/>
       </w:pPr>
       <w:r>
+        <w:rPr>
+          <w:rStyle w:val="SectionNumber"/>
+        </w:rPr>
+        <w:t xml:space="preserve">1</w:t>
+      </w:r>
+      <w:r>
+        <w:tab/>
+      </w:r>
+      <w:r>
         <w:t xml:space="preserve">1. Introduction</w:t>
       </w:r>
     </w:p>
@@ -475,6 +484,15 @@
       <w:pPr>
         <w:pStyle w:val="Heading1"/>
       </w:pPr>
+      <w:r>
+        <w:rPr>
+          <w:rStyle w:val="SectionNumber"/>
+        </w:rPr>
+        <w:t xml:space="preserve">2</w:t>
+      </w:r>
+      <w:r>
+        <w:tab/>
+      </w:r>
       <w:r>
         <w:t xml:space="preserve">2. Concepts</w:t>
       </w:r>
@@ -1069,6 +1087,15 @@
       <w:pPr>
         <w:pStyle w:val="Heading1"/>
       </w:pPr>
+      <w:r>
+        <w:rPr>
+          <w:rStyle w:val="SectionNumber"/>
+        </w:rPr>
+        <w:t xml:space="preserve">3</w:t>
+      </w:r>
+      <w:r>
+        <w:tab/>
+      </w:r>
       <w:r>
         <w:t xml:space="preserve">3. Pipeline architecture</w:t>
       </w:r>
@@ -2357,6 +2384,15 @@
         <w:pStyle w:val="Heading1"/>
       </w:pPr>
       <w:r>
+        <w:rPr>
+          <w:rStyle w:val="SectionNumber"/>
+        </w:rPr>
+        <w:t xml:space="preserve">4</w:t>
+      </w:r>
+      <w:r>
+        <w:tab/>
+      </w:r>
+      <w:r>
         <w:t xml:space="preserve">4. Installation</w:t>
       </w:r>
     </w:p>
@@ -2444,6 +2480,15 @@
         <w:pStyle w:val="Heading2"/>
       </w:pPr>
       <w:r>
+        <w:rPr>
+          <w:rStyle w:val="SectionNumber"/>
+        </w:rPr>
+        <w:t xml:space="preserve">4.1</w:t>
+      </w:r>
+      <w:r>
+        <w:tab/>
+      </w:r>
+      <w:r>
         <w:t xml:space="preserve">4.1 Local install (personal computer)</w:t>
       </w:r>
     </w:p>
@@ -2913,6 +2958,15 @@
         <w:pStyle w:val="Heading2"/>
       </w:pPr>
       <w:r>
+        <w:rPr>
+          <w:rStyle w:val="SectionNumber"/>
+        </w:rPr>
+        <w:t xml:space="preserve">4.2</w:t>
+      </w:r>
+      <w:r>
+        <w:tab/>
+      </w:r>
+      <w:r>
         <w:t xml:space="preserve">4.2 Shared HPC install (SLURM + Apptainer/Singularity)</w:t>
       </w:r>
     </w:p>
@@ -3722,6 +3776,15 @@
       <w:pPr>
         <w:pStyle w:val="Heading2"/>
       </w:pPr>
+      <w:r>
+        <w:rPr>
+          <w:rStyle w:val="SectionNumber"/>
+        </w:rPr>
+        <w:t xml:space="preserve">4.3</w:t>
+      </w:r>
+      <w:r>
+        <w:tab/>
+      </w:r>
       <w:r>
         <w:t xml:space="preserve">4.3 The</w:t>
       </w:r>
@@ -4196,6 +4259,15 @@
         <w:pStyle w:val="Heading2"/>
       </w:pPr>
       <w:r>
+        <w:rPr>
+          <w:rStyle w:val="SectionNumber"/>
+        </w:rPr>
+        <w:t xml:space="preserve">4.4</w:t>
+      </w:r>
+      <w:r>
+        <w:tab/>
+      </w:r>
+      <w:r>
         <w:t xml:space="preserve">4.4 How CallForge uses conda environments</w:t>
       </w:r>
     </w:p>
@@ -4602,6 +4674,15 @@
         <w:pStyle w:val="Heading1"/>
       </w:pPr>
       <w:r>
+        <w:rPr>
+          <w:rStyle w:val="SectionNumber"/>
+        </w:rPr>
+        <w:t xml:space="preserve">5</w:t>
+      </w:r>
+      <w:r>
+        <w:tab/>
+      </w:r>
+      <w:r>
         <w:t xml:space="preserve">5. Inputs</w:t>
       </w:r>
     </w:p>
@@ -4610,6 +4691,15 @@
       <w:pPr>
         <w:pStyle w:val="Heading2"/>
       </w:pPr>
+      <w:r>
+        <w:rPr>
+          <w:rStyle w:val="SectionNumber"/>
+        </w:rPr>
+        <w:t xml:space="preserve">5.1</w:t>
+      </w:r>
+      <w:r>
+        <w:tab/>
+      </w:r>
       <w:r>
         <w:t xml:space="preserve">5.1 Sample sheet (CSV) —</w:t>
       </w:r>
@@ -6977,6 +7067,15 @@
       <w:pPr>
         <w:pStyle w:val="Heading2"/>
       </w:pPr>
+      <w:r>
+        <w:rPr>
+          <w:rStyle w:val="SectionNumber"/>
+        </w:rPr>
+        <w:t xml:space="preserve">5.2</w:t>
+      </w:r>
+      <w:r>
+        <w:tab/>
+      </w:r>
       <w:r>
         <w:t xml:space="preserve">5.2 Target BED &amp; gene metadata — CallForge runs without CaptureForge</w:t>
       </w:r>
@@ -8378,6 +8477,15 @@
         <w:pStyle w:val="Heading2"/>
       </w:pPr>
       <w:r>
+        <w:rPr>
+          <w:rStyle w:val="SectionNumber"/>
+        </w:rPr>
+        <w:t xml:space="preserve">5.3</w:t>
+      </w:r>
+      <w:r>
+        <w:tab/>
+      </w:r>
+      <w:r>
         <w:t xml:space="preserve">5.3 Reference —</w:t>
       </w:r>
       <w:r>
@@ -8473,6 +8581,15 @@
         <w:pStyle w:val="Heading1"/>
       </w:pPr>
       <w:r>
+        <w:rPr>
+          <w:rStyle w:val="SectionNumber"/>
+        </w:rPr>
+        <w:t xml:space="preserve">6</w:t>
+      </w:r>
+      <w:r>
+        <w:tab/>
+      </w:r>
+      <w:r>
         <w:t xml:space="preserve">6. Annotation databases</w:t>
       </w:r>
     </w:p>
@@ -8596,6 +8713,15 @@
       <w:pPr>
         <w:pStyle w:val="Heading2"/>
       </w:pPr>
+      <w:r>
+        <w:rPr>
+          <w:rStyle w:val="SectionNumber"/>
+        </w:rPr>
+        <w:t xml:space="preserve">6.1</w:t>
+      </w:r>
+      <w:r>
+        <w:tab/>
+      </w:r>
       <w:r>
         <w:t xml:space="preserve">6.1 The databases</w:t>
       </w:r>
@@ -9023,6 +9149,15 @@
         <w:pStyle w:val="Heading2"/>
       </w:pPr>
       <w:r>
+        <w:rPr>
+          <w:rStyle w:val="SectionNumber"/>
+        </w:rPr>
+        <w:t xml:space="preserve">6.2</w:t>
+      </w:r>
+      <w:r>
+        <w:tab/>
+      </w:r>
+      <w:r>
         <w:t xml:space="preserve">6.2 The genomic-scope gate (fail-loud)</w:t>
       </w:r>
     </w:p>
@@ -9238,6 +9373,15 @@
         <w:pStyle w:val="Heading2"/>
       </w:pPr>
       <w:r>
+        <w:rPr>
+          <w:rStyle w:val="SectionNumber"/>
+        </w:rPr>
+        <w:t xml:space="preserve">6.3</w:t>
+      </w:r>
+      <w:r>
+        <w:tab/>
+      </w:r>
+      <w:r>
         <w:t xml:space="preserve">6.3 Contig-naming / chr-reconciliation</w:t>
       </w:r>
     </w:p>
@@ -9356,6 +9500,15 @@
         <w:pStyle w:val="Heading2"/>
       </w:pPr>
       <w:r>
+        <w:rPr>
+          <w:rStyle w:val="SectionNumber"/>
+        </w:rPr>
+        <w:t xml:space="preserve">6.4</w:t>
+      </w:r>
+      <w:r>
+        <w:tab/>
+      </w:r>
+      <w:r>
         <w:t xml:space="preserve">6.4 Fetching databases —</w:t>
       </w:r>
       <w:r>
@@ -9615,6 +9768,15 @@
         <w:pStyle w:val="Heading2"/>
       </w:pPr>
       <w:r>
+        <w:rPr>
+          <w:rStyle w:val="SectionNumber"/>
+        </w:rPr>
+        <w:t xml:space="preserve">6.5</w:t>
+      </w:r>
+      <w:r>
+        <w:tab/>
+      </w:r>
+      <w:r>
         <w:t xml:space="preserve">6.5 Resource auto-discovery</w:t>
       </w:r>
     </w:p>
@@ -9707,6 +9869,15 @@
       <w:pPr>
         <w:pStyle w:val="Heading2"/>
       </w:pPr>
+      <w:r>
+        <w:rPr>
+          <w:rStyle w:val="SectionNumber"/>
+        </w:rPr>
+        <w:t xml:space="preserve">6.6</w:t>
+      </w:r>
+      <w:r>
+        <w:tab/>
+      </w:r>
       <w:r>
         <w:t xml:space="preserve">6.6 Bring-your-own / non-human databases</w:t>
       </w:r>
@@ -9859,6 +10030,15 @@
       <w:pPr>
         <w:pStyle w:val="Heading1"/>
       </w:pPr>
+      <w:r>
+        <w:rPr>
+          <w:rStyle w:val="SectionNumber"/>
+        </w:rPr>
+        <w:t xml:space="preserve">7</w:t>
+      </w:r>
+      <w:r>
+        <w:tab/>
+      </w:r>
       <w:r>
         <w:t xml:space="preserve">7. Configuration</w:t>
       </w:r>
@@ -11131,7 +11311,7 @@
         <w:rPr>
           <w:rStyle w:val="VerbatimChar"/>
         </w:rPr>
-        <w:t xml:space="preserve">ensemblorg/ensembl-vep:release_110.0</w:t>
+        <w:t xml:space="preserve">ensemblorg/ensembl-vep:release_112.0</w:t>
       </w:r>
       <w:r>
         <w:t xml:space="preserve"> </w:t>
@@ -11184,6 +11364,15 @@
       <w:pPr>
         <w:pStyle w:val="Heading2"/>
       </w:pPr>
+      <w:r>
+        <w:rPr>
+          <w:rStyle w:val="SectionNumber"/>
+        </w:rPr>
+        <w:t xml:space="preserve">7.1</w:t>
+      </w:r>
+      <w:r>
+        <w:tab/>
+      </w:r>
       <w:r>
         <w:t xml:space="preserve">7.1 Compute resources</w:t>
       </w:r>
@@ -11599,7 +11788,7 @@
               <w:jc w:val="left"/>
             </w:pPr>
             <w:r>
-              <w:t xml:space="preserve">max total cores CallForge uses at once on this machine</w:t>
+              <w:t xml:space="preserve">max total cores CallForge uses at once on the local machine</w:t>
             </w:r>
           </w:p>
         </w:tc>
@@ -12008,6 +12197,15 @@
       <w:pPr>
         <w:pStyle w:val="Heading2"/>
       </w:pPr>
+      <w:r>
+        <w:rPr>
+          <w:rStyle w:val="SectionNumber"/>
+        </w:rPr>
+        <w:t xml:space="preserve">7.2</w:t>
+      </w:r>
+      <w:r>
+        <w:tab/>
+      </w:r>
       <w:r>
         <w:t xml:space="preserve">7.2 Parameter Reference (complete)</w:t>
       </w:r>
@@ -14966,7 +15164,7 @@
               <w:rPr>
                 <w:rStyle w:val="VerbatimChar"/>
               </w:rPr>
-              <w:t xml:space="preserve">ensemblorg/ensembl-vep:release_110.0</w:t>
+              <w:t xml:space="preserve">ensemblorg/ensembl-vep:release_112.0</w:t>
             </w:r>
           </w:p>
         </w:tc>
@@ -16333,6 +16531,15 @@
       <w:pPr>
         <w:pStyle w:val="Heading3"/>
       </w:pPr>
+      <w:r>
+        <w:rPr>
+          <w:rStyle w:val="SectionNumber"/>
+        </w:rPr>
+        <w:t xml:space="preserve">7.2.1</w:t>
+      </w:r>
+      <w:r>
+        <w:tab/>
+      </w:r>
       <w:r>
         <w:t xml:space="preserve">Expanded vs. short run (the same run, two ways)</w:t>
       </w:r>
@@ -16696,6 +16903,15 @@
         <w:pStyle w:val="Heading1"/>
       </w:pPr>
       <w:r>
+        <w:rPr>
+          <w:rStyle w:val="SectionNumber"/>
+        </w:rPr>
+        <w:t xml:space="preserve">8</w:t>
+      </w:r>
+      <w:r>
+        <w:tab/>
+      </w:r>
+      <w:r>
         <w:t xml:space="preserve">8. Running — step-by-step scenarios</w:t>
       </w:r>
     </w:p>
@@ -16760,6 +16976,15 @@
       <w:pPr>
         <w:pStyle w:val="Heading2"/>
       </w:pPr>
+      <w:r>
+        <w:rPr>
+          <w:rStyle w:val="SectionNumber"/>
+        </w:rPr>
+        <w:t xml:space="preserve">8.1</w:t>
+      </w:r>
+      <w:r>
+        <w:tab/>
+      </w:r>
       <w:r>
         <w:t xml:space="preserve">8.0 How to invoke CallForge (command hierarchy)</w:t>
       </w:r>
@@ -17484,6 +17709,15 @@
       <w:pPr>
         <w:pStyle w:val="Heading3"/>
       </w:pPr>
+      <w:r>
+        <w:rPr>
+          <w:rStyle w:val="SectionNumber"/>
+        </w:rPr>
+        <w:t xml:space="preserve">8.1.1</w:t>
+      </w:r>
+      <w:r>
+        <w:tab/>
+      </w:r>
       <w:r>
         <w:t xml:space="preserve">Understanding profiles</w:t>
       </w:r>
@@ -17884,7 +18118,7 @@
         <w:rPr>
           <w:rStyle w:val="CommentTok"/>
         </w:rPr>
-        <w:t xml:space="preserve"># this machine, conda envs</w:t>
+        <w:t xml:space="preserve"># local machine, conda envs</w:t>
       </w:r>
       <w:r>
         <w:br/>
@@ -18020,6 +18254,15 @@
         <w:pStyle w:val="Heading2"/>
       </w:pPr>
       <w:r>
+        <w:rPr>
+          <w:rStyle w:val="SectionNumber"/>
+        </w:rPr>
+        <w:t xml:space="preserve">8.2</w:t>
+      </w:r>
+      <w:r>
+        <w:tab/>
+      </w:r>
+      <w:r>
         <w:t xml:space="preserve">8.1 Quickstart (test profile)</w:t>
       </w:r>
     </w:p>
@@ -18097,6 +18340,15 @@
         <w:pStyle w:val="Heading2"/>
       </w:pPr>
       <w:r>
+        <w:rPr>
+          <w:rStyle w:val="SectionNumber"/>
+        </w:rPr>
+        <w:t xml:space="preserve">8.3</w:t>
+      </w:r>
+      <w:r>
+        <w:tab/>
+      </w:r>
+      <w:r>
         <w:t xml:space="preserve">8.2 Full human cohort (primary scenario)</w:t>
       </w:r>
     </w:p>
@@ -18351,6 +18603,15 @@
         <w:pStyle w:val="Heading2"/>
       </w:pPr>
       <w:r>
+        <w:rPr>
+          <w:rStyle w:val="SectionNumber"/>
+        </w:rPr>
+        <w:t xml:space="preserve">8.4</w:t>
+      </w:r>
+      <w:r>
+        <w:tab/>
+      </w:r>
+      <w:r>
         <w:t xml:space="preserve">8.3 Callset-only (no phenotype)</w:t>
       </w:r>
     </w:p>
@@ -18436,6 +18697,15 @@
         <w:pStyle w:val="Heading2"/>
       </w:pPr>
       <w:r>
+        <w:rPr>
+          <w:rStyle w:val="SectionNumber"/>
+        </w:rPr>
+        <w:t xml:space="preserve">8.5</w:t>
+      </w:r>
+      <w:r>
+        <w:tab/>
+      </w:r>
+      <w:r>
         <w:t xml:space="preserve">8.4 Burden / association run (with phenotype)</w:t>
       </w:r>
     </w:p>
@@ -18730,6 +19000,15 @@
         <w:pStyle w:val="Heading2"/>
       </w:pPr>
       <w:r>
+        <w:rPr>
+          <w:rStyle w:val="SectionNumber"/>
+        </w:rPr>
+        <w:t xml:space="preserve">8.6</w:t>
+      </w:r>
+      <w:r>
+        <w:tab/>
+      </w:r>
+      <w:r>
         <w:t xml:space="preserve">8.5 A different panel</w:t>
       </w:r>
     </w:p>
@@ -18885,6 +19164,15 @@
         <w:pStyle w:val="Heading2"/>
       </w:pPr>
       <w:r>
+        <w:rPr>
+          <w:rStyle w:val="SectionNumber"/>
+        </w:rPr>
+        <w:t xml:space="preserve">8.7</w:t>
+      </w:r>
+      <w:r>
+        <w:tab/>
+      </w:r>
+      <w:r>
         <w:t xml:space="preserve">8.6 A different organism</w:t>
       </w:r>
     </w:p>
@@ -19301,6 +19589,15 @@
         <w:pStyle w:val="Heading2"/>
       </w:pPr>
       <w:r>
+        <w:rPr>
+          <w:rStyle w:val="SectionNumber"/>
+        </w:rPr>
+        <w:t xml:space="preserve">8.8</w:t>
+      </w:r>
+      <w:r>
+        <w:tab/>
+      </w:r>
+      <w:r>
         <w:t xml:space="preserve">8.7 HPC run</w:t>
       </w:r>
     </w:p>
@@ -19457,6 +19754,15 @@
         <w:pStyle w:val="Heading2"/>
       </w:pPr>
       <w:r>
+        <w:rPr>
+          <w:rStyle w:val="SectionNumber"/>
+        </w:rPr>
+        <w:t xml:space="preserve">8.9</w:t>
+      </w:r>
+      <w:r>
+        <w:tab/>
+      </w:r>
+      <w:r>
         <w:t xml:space="preserve">8.8 Choosing engine alternatives</w:t>
       </w:r>
     </w:p>
@@ -19653,6 +19959,15 @@
         <w:pStyle w:val="Heading2"/>
       </w:pPr>
       <w:r>
+        <w:rPr>
+          <w:rStyle w:val="SectionNumber"/>
+        </w:rPr>
+        <w:t xml:space="preserve">8.10</w:t>
+      </w:r>
+      <w:r>
+        <w:tab/>
+      </w:r>
+      <w:r>
         <w:t xml:space="preserve">8.9 GIAB validation run</w:t>
       </w:r>
     </w:p>
@@ -19822,6 +20137,15 @@
       <w:pPr>
         <w:pStyle w:val="Heading2"/>
       </w:pPr>
+      <w:r>
+        <w:rPr>
+          <w:rStyle w:val="SectionNumber"/>
+        </w:rPr>
+        <w:t xml:space="preserve">8.11</w:t>
+      </w:r>
+      <w:r>
+        <w:tab/>
+      </w:r>
       <w:r>
         <w:t xml:space="preserve">8.10 Stage subcommands (run one stage standalone)</w:t>
       </w:r>
@@ -21810,6 +22134,15 @@
         <w:pStyle w:val="Heading3"/>
       </w:pPr>
       <w:r>
+        <w:rPr>
+          <w:rStyle w:val="SectionNumber"/>
+        </w:rPr>
+        <w:t xml:space="preserve">8.11.1</w:t>
+      </w:r>
+      <w:r>
+        <w:tab/>
+      </w:r>
+      <w:r>
         <w:t xml:space="preserve">Worked examples</w:t>
       </w:r>
     </w:p>
@@ -22592,6 +22925,15 @@
         <w:pStyle w:val="Heading1"/>
       </w:pPr>
       <w:r>
+        <w:rPr>
+          <w:rStyle w:val="SectionNumber"/>
+        </w:rPr>
+        <w:t xml:space="preserve">9</w:t>
+      </w:r>
+      <w:r>
+        <w:tab/>
+      </w:r>
+      <w:r>
         <w:t xml:space="preserve">9. Quality control</w:t>
       </w:r>
     </w:p>
@@ -22673,6 +23015,15 @@
       <w:pPr>
         <w:pStyle w:val="Heading2"/>
       </w:pPr>
+      <w:r>
+        <w:rPr>
+          <w:rStyle w:val="SectionNumber"/>
+        </w:rPr>
+        <w:t xml:space="preserve">9.1</w:t>
+      </w:r>
+      <w:r>
+        <w:tab/>
+      </w:r>
       <w:r>
         <w:t xml:space="preserve">9.1 Read &amp; alignment QC (Stages 1–4)</w:t>
       </w:r>
@@ -23081,6 +23432,15 @@
         <w:pStyle w:val="Heading2"/>
       </w:pPr>
       <w:r>
+        <w:rPr>
+          <w:rStyle w:val="SectionNumber"/>
+        </w:rPr>
+        <w:t xml:space="preserve">9.2</w:t>
+      </w:r>
+      <w:r>
+        <w:tab/>
+      </w:r>
+      <w:r>
         <w:t xml:space="preserve">9.2 Per-sample QC gate &amp; quarantine (Stage 5)</w:t>
       </w:r>
     </w:p>
@@ -23423,6 +23783,15 @@
         <w:pStyle w:val="Heading2"/>
       </w:pPr>
       <w:r>
+        <w:rPr>
+          <w:rStyle w:val="SectionNumber"/>
+        </w:rPr>
+        <w:t xml:space="preserve">9.3</w:t>
+      </w:r>
+      <w:r>
+        <w:tab/>
+      </w:r>
+      <w:r>
         <w:t xml:space="preserve">9.3 Cohort QC dashboard &amp; MultiQC (Stage 15)</w:t>
       </w:r>
     </w:p>
@@ -23503,6 +23872,15 @@
         <w:pStyle w:val="Heading1"/>
       </w:pPr>
       <w:r>
+        <w:rPr>
+          <w:rStyle w:val="SectionNumber"/>
+        </w:rPr>
+        <w:t xml:space="preserve">10</w:t>
+      </w:r>
+      <w:r>
+        <w:tab/>
+      </w:r>
+      <w:r>
         <w:t xml:space="preserve">10. Stage details &amp; their plots</w:t>
       </w:r>
     </w:p>
@@ -23511,6 +23889,15 @@
       <w:pPr>
         <w:pStyle w:val="Heading2"/>
       </w:pPr>
+      <w:r>
+        <w:rPr>
+          <w:rStyle w:val="SectionNumber"/>
+        </w:rPr>
+        <w:t xml:space="preserve">10.1</w:t>
+      </w:r>
+      <w:r>
+        <w:tab/>
+      </w:r>
       <w:r>
         <w:t xml:space="preserve">10.1 SNV/indel calling &amp; filtering (Stages 6–7)</w:t>
       </w:r>
@@ -23852,6 +24239,15 @@
         <w:pStyle w:val="Heading2"/>
       </w:pPr>
       <w:r>
+        <w:rPr>
+          <w:rStyle w:val="SectionNumber"/>
+        </w:rPr>
+        <w:t xml:space="preserve">10.2</w:t>
+      </w:r>
+      <w:r>
+        <w:tab/>
+      </w:r>
+      <w:r>
         <w:t xml:space="preserve">10.2 CNV, STR, paralog (Stages 8–10)</w:t>
       </w:r>
     </w:p>
@@ -24200,6 +24596,15 @@
         <w:pStyle w:val="Heading2"/>
       </w:pPr>
       <w:r>
+        <w:rPr>
+          <w:rStyle w:val="SectionNumber"/>
+        </w:rPr>
+        <w:t xml:space="preserve">10.3</w:t>
+      </w:r>
+      <w:r>
+        <w:tab/>
+      </w:r>
+      <w:r>
         <w:t xml:space="preserve">10.3 Annotation (Stage 11)</w:t>
       </w:r>
     </w:p>
@@ -24485,6 +24890,15 @@
         <w:pStyle w:val="Heading2"/>
       </w:pPr>
       <w:r>
+        <w:rPr>
+          <w:rStyle w:val="SectionNumber"/>
+        </w:rPr>
+        <w:t xml:space="preserve">10.4</w:t>
+      </w:r>
+      <w:r>
+        <w:tab/>
+      </w:r>
+      <w:r>
         <w:t xml:space="preserve">10.4 Cohort QC (Stage 12)</w:t>
       </w:r>
     </w:p>
@@ -24715,6 +25129,15 @@
         <w:pStyle w:val="Heading2"/>
       </w:pPr>
       <w:r>
+        <w:rPr>
+          <w:rStyle w:val="SectionNumber"/>
+        </w:rPr>
+        <w:t xml:space="preserve">10.5</w:t>
+      </w:r>
+      <w:r>
+        <w:tab/>
+      </w:r>
+      <w:r>
         <w:t xml:space="preserve">10.5 GIAB validation (Stage 13)</w:t>
       </w:r>
     </w:p>
@@ -24835,6 +25258,15 @@
         <w:pStyle w:val="Heading2"/>
       </w:pPr>
       <w:r>
+        <w:rPr>
+          <w:rStyle w:val="SectionNumber"/>
+        </w:rPr>
+        <w:t xml:space="preserve">10.6</w:t>
+      </w:r>
+      <w:r>
+        <w:tab/>
+      </w:r>
+      <w:r>
         <w:t xml:space="preserve">10.6 Burden (Stage 14)</w:t>
       </w:r>
     </w:p>
@@ -24956,6 +25388,15 @@
         <w:pStyle w:val="Heading1"/>
       </w:pPr>
       <w:r>
+        <w:rPr>
+          <w:rStyle w:val="SectionNumber"/>
+        </w:rPr>
+        <w:t xml:space="preserve">11</w:t>
+      </w:r>
+      <w:r>
+        <w:tab/>
+      </w:r>
+      <w:r>
         <w:t xml:space="preserve">11. Outputs explained</w:t>
       </w:r>
     </w:p>
@@ -25555,6 +25996,15 @@
         <w:pStyle w:val="Heading1"/>
       </w:pPr>
       <w:r>
+        <w:rPr>
+          <w:rStyle w:val="SectionNumber"/>
+        </w:rPr>
+        <w:t xml:space="preserve">12</w:t>
+      </w:r>
+      <w:r>
+        <w:tab/>
+      </w:r>
+      <w:r>
         <w:t xml:space="preserve">12. Interpreting results</w:t>
       </w:r>
     </w:p>
@@ -25898,6 +26348,15 @@
       <w:pPr>
         <w:pStyle w:val="Heading1"/>
       </w:pPr>
+      <w:r>
+        <w:rPr>
+          <w:rStyle w:val="SectionNumber"/>
+        </w:rPr>
+        <w:t xml:space="preserve">13</w:t>
+      </w:r>
+      <w:r>
+        <w:tab/>
+      </w:r>
       <w:r>
         <w:t xml:space="preserve">13. Real-run checklist</w:t>
       </w:r>
@@ -26152,6 +26611,15 @@
       <w:pPr>
         <w:pStyle w:val="Heading1"/>
       </w:pPr>
+      <w:r>
+        <w:rPr>
+          <w:rStyle w:val="SectionNumber"/>
+        </w:rPr>
+        <w:t xml:space="preserve">14</w:t>
+      </w:r>
+      <w:r>
+        <w:tab/>
+      </w:r>
       <w:r>
         <w:t xml:space="preserve">14. Troubleshooting</w:t>
       </w:r>
@@ -26826,6 +27294,15 @@
         <w:pStyle w:val="Heading1"/>
       </w:pPr>
       <w:r>
+        <w:rPr>
+          <w:rStyle w:val="SectionNumber"/>
+        </w:rPr>
+        <w:t xml:space="preserve">15</w:t>
+      </w:r>
+      <w:r>
+        <w:tab/>
+      </w:r>
+      <w:r>
         <w:t xml:space="preserve">15. Extending CallForge</w:t>
       </w:r>
     </w:p>
@@ -26948,6 +27425,15 @@
         <w:pStyle w:val="Heading1"/>
       </w:pPr>
       <w:r>
+        <w:rPr>
+          <w:rStyle w:val="SectionNumber"/>
+        </w:rPr>
+        <w:t xml:space="preserve">16</w:t>
+      </w:r>
+      <w:r>
+        <w:tab/>
+      </w:r>
+      <w:r>
         <w:t xml:space="preserve">16. Reproducibility &amp; provenance</w:t>
       </w:r>
     </w:p>
@@ -27058,6 +27544,15 @@
       <w:pPr>
         <w:pStyle w:val="Heading1"/>
       </w:pPr>
+      <w:r>
+        <w:rPr>
+          <w:rStyle w:val="SectionNumber"/>
+        </w:rPr>
+        <w:t xml:space="preserve">17</w:t>
+      </w:r>
+      <w:r>
+        <w:tab/>
+      </w:r>
       <w:r>
         <w:t xml:space="preserve">17. Glossary &amp; FAQ</w:t>
       </w:r>
@@ -27310,6 +27805,15 @@
       <w:pPr>
         <w:pStyle w:val="Heading1"/>
       </w:pPr>
+      <w:r>
+        <w:rPr>
+          <w:rStyle w:val="SectionNumber"/>
+        </w:rPr>
+        <w:t xml:space="preserve">18</w:t>
+      </w:r>
+      <w:r>
+        <w:tab/>
+      </w:r>
       <w:r>
         <w:t xml:space="preserve">18. Citation &amp; the CaptureForge ↔ CallForge pairing</w:t>
       </w:r>

</xml_diff>